<commit_message>
Sales and Leases outline: drop the exam game plan and rapid review
Removes the opening exam game plan box and the whole Rapid Review section
(numbers to know, merchant table, top traps). Course of performance,
course of dealing, usage of trade, statute of frauds and no-oral-modification
are now spelled out where they first appear in the remaining text.

Co-Authored-By: Claude Opus 5.5 <noreply@anthropic.com>
</commit_message>
<xml_diff>
--- a/content/Sales and Leases/Sales_and_Leases_Week10_Condensed_Outline.docx
+++ b/content/Sales and Leases/Sales_and_Leases_Week10_Condensed_Outline.docx
@@ -118,250 +118,6 @@
         <w:spacing w:after="0" w:line="120" w:lineRule="exact"/>
       </w:pPr>
       <w:r/>
-    </w:p>
-    <w:tbl>
-      <w:tblPr>
-        <w:tblW w:type="auto" w:w="0"/>
-        <w:tblLook w:firstColumn="1" w:firstRow="1" w:lastColumn="0" w:lastRow="0" w:noHBand="0" w:noVBand="1" w:val="04A0"/>
-        <w:tblW w:w="5000" w:type="pct"/>
-        <w:tblBorders>
-          <w:top w:val="nil"/>
-          <w:left w:val="nil"/>
-          <w:bottom w:val="nil"/>
-          <w:right w:val="nil"/>
-          <w:insideH w:val="nil"/>
-          <w:insideV w:val="nil"/>
-        </w:tblBorders>
-      </w:tblPr>
-      <w:tblGrid>
-        <w:gridCol w:w="10512"/>
-      </w:tblGrid>
-      <w:tr>
-        <w:trPr>
-          <w:cantSplit w:val="true"/>
-        </w:trPr>
-        <w:tc>
-          <w:tcPr>
-            <w:tcW w:type="dxa" w:w="10512"/>
-            <w:shd w:val="clear" w:color="auto" w:fill="F3F3F3"/>
-            <w:tcMar>
-              <w:top w:w="70" w:type="dxa"/>
-              <w:bottom w:w="70" w:type="dxa"/>
-              <w:left w:w="140" w:type="dxa"/>
-              <w:right w:w="120" w:type="dxa"/>
-            </w:tcMar>
-            <w:tcBorders>
-              <w:left w:val="single" w:sz="30" w:space="0" w:color="595959"/>
-            </w:tcBorders>
-          </w:tcPr>
-          <w:p>
-            <w:pPr>
-              <w:spacing w:after="30" w:line="240" w:lineRule="auto"/>
-            </w:pPr>
-            <w:r>
-              <w:rPr>
-                <w:b/>
-                <w:color w:val="595959"/>
-                <w:sz w:val="15"/>
-              </w:rPr>
-              <w:t xml:space="preserve">ROADMAP   </w:t>
-            </w:r>
-            <w:r>
-              <w:rPr>
-                <w:b/>
-                <w:i w:val="0"/>
-                <w:sz w:val="21"/>
-              </w:rPr>
-              <w:t>Exam game plan — run every fact pattern through this sequence</w:t>
-            </w:r>
-          </w:p>
-          <w:p>
-            <w:pPr>
-              <w:spacing w:after="30" w:line="240" w:lineRule="auto"/>
-              <w:ind w:left="317" w:hanging="259"/>
-            </w:pPr>
-            <w:r>
-              <w:rPr>
-                <w:b/>
-                <w:color w:val="595959"/>
-                <w:sz w:val="21"/>
-              </w:rPr>
-              <w:t xml:space="preserve">1.  </w:t>
-            </w:r>
-            <w:r>
-              <w:rPr>
-                <w:b/>
-                <w:i w:val="0"/>
-                <w:sz w:val="21"/>
-              </w:rPr>
-              <w:t>Governing law?</w:t>
-            </w:r>
-            <w:r>
-              <w:rPr>
-                <w:b w:val="0"/>
-                <w:i w:val="0"/>
-                <w:sz w:val="21"/>
-              </w:rPr>
-              <w:t xml:space="preserve"> Goods (§ 2-105, § 2-107) · hybrid (§ 2-102(2)) · disguised security interest (§ 2-102(3)(a)).</w:t>
-            </w:r>
-          </w:p>
-          <w:p>
-            <w:pPr>
-              <w:spacing w:after="30" w:line="240" w:lineRule="auto"/>
-              <w:ind w:left="317" w:hanging="259"/>
-            </w:pPr>
-            <w:r>
-              <w:rPr>
-                <w:b/>
-                <w:color w:val="595959"/>
-                <w:sz w:val="21"/>
-              </w:rPr>
-              <w:t xml:space="preserve">2.  </w:t>
-            </w:r>
-            <w:r>
-              <w:rPr>
-                <w:b/>
-                <w:i w:val="0"/>
-                <w:sz w:val="21"/>
-              </w:rPr>
-              <w:t>Agreement formed?</w:t>
-            </w:r>
-            <w:r>
-              <w:rPr>
-                <w:b w:val="0"/>
-                <w:i w:val="0"/>
-                <w:sz w:val="21"/>
-              </w:rPr>
-              <w:t xml:space="preserve"> §§ 2-204 → 2-206 → 2-205 → 2-207.</w:t>
-            </w:r>
-          </w:p>
-          <w:p>
-            <w:pPr>
-              <w:spacing w:after="30" w:line="240" w:lineRule="auto"/>
-              <w:ind w:left="317" w:hanging="259"/>
-            </w:pPr>
-            <w:r>
-              <w:rPr>
-                <w:b/>
-                <w:color w:val="595959"/>
-                <w:sz w:val="21"/>
-              </w:rPr>
-              <w:t xml:space="preserve">3.  </w:t>
-            </w:r>
-            <w:r>
-              <w:rPr>
-                <w:b/>
-                <w:i w:val="0"/>
-                <w:sz w:val="21"/>
-              </w:rPr>
-              <w:t>Enforceable?</w:t>
-            </w:r>
-            <w:r>
-              <w:rPr>
-                <w:b w:val="0"/>
-                <w:i w:val="0"/>
-                <w:sz w:val="21"/>
-              </w:rPr>
-              <w:t xml:space="preserve"> Statute of frauds (§ 2-201) · unconscionability (§ 2-302).</w:t>
-            </w:r>
-          </w:p>
-          <w:p>
-            <w:pPr>
-              <w:spacing w:after="30" w:line="240" w:lineRule="auto"/>
-              <w:ind w:left="317" w:hanging="259"/>
-            </w:pPr>
-            <w:r>
-              <w:rPr>
-                <w:b/>
-                <w:color w:val="595959"/>
-                <w:sz w:val="21"/>
-              </w:rPr>
-              <w:t xml:space="preserve">4.  </w:t>
-            </w:r>
-            <w:r>
-              <w:rPr>
-                <w:b/>
-                <w:i w:val="0"/>
-                <w:sz w:val="21"/>
-              </w:rPr>
-              <w:t>Terms?</w:t>
-            </w:r>
-            <w:r>
-              <w:rPr>
-                <w:b w:val="0"/>
-                <w:i w:val="0"/>
-                <w:sz w:val="21"/>
-              </w:rPr>
-              <w:t xml:space="preserve"> Express terms → course of performance (CoP) / course of dealing (CoD) / usage of trade (UoT) (§ 1-303) → express warranties (§ 2-313) → gap fillers → disclaimers/remedy limits → parol evidence rule (§ 2-202).</w:t>
-            </w:r>
-          </w:p>
-          <w:p>
-            <w:pPr>
-              <w:spacing w:after="30" w:line="240" w:lineRule="auto"/>
-              <w:ind w:left="317" w:hanging="259"/>
-            </w:pPr>
-            <w:r>
-              <w:rPr>
-                <w:b/>
-                <w:color w:val="595959"/>
-                <w:sz w:val="21"/>
-              </w:rPr>
-              <w:t xml:space="preserve">5.  </w:t>
-            </w:r>
-            <w:r>
-              <w:rPr>
-                <w:b/>
-                <w:i w:val="0"/>
-                <w:sz w:val="21"/>
-              </w:rPr>
-              <w:t>Changed?</w:t>
-            </w:r>
-            <w:r>
-              <w:rPr>
-                <w:b w:val="0"/>
-                <w:i w:val="0"/>
-                <w:sz w:val="21"/>
-              </w:rPr>
-              <w:t xml:space="preserve"> Modification · statute of frauds (SOF) / no-oral-modification (NOM) clauses · waiver · estoppel · course of performance.</w:t>
-            </w:r>
-          </w:p>
-          <w:p>
-            <w:pPr>
-              <w:spacing w:after="30" w:line="240" w:lineRule="auto"/>
-              <w:ind w:left="317" w:hanging="259"/>
-            </w:pPr>
-            <w:r>
-              <w:rPr>
-                <w:b/>
-                <w:color w:val="595959"/>
-                <w:sz w:val="21"/>
-              </w:rPr>
-              <w:t xml:space="preserve">6.  </w:t>
-            </w:r>
-            <w:r>
-              <w:rPr>
-                <w:b/>
-                <w:i w:val="0"/>
-                <w:sz w:val="21"/>
-              </w:rPr>
-              <w:t>Performance:</w:t>
-            </w:r>
-            <w:r>
-              <w:rPr>
-                <w:b w:val="0"/>
-                <w:i w:val="0"/>
-                <w:sz w:val="21"/>
-              </w:rPr>
-              <w:t xml:space="preserve"> tender → inspection → accept/reject → payment → risk of loss · assignment/delegation · termination · insecurity/repudiation · excuse.</w:t>
-            </w:r>
-          </w:p>
-        </w:tc>
-      </w:tr>
-    </w:tbl>
-    <w:p>
-      <w:pPr>
-        <w:spacing w:after="0" w:line="100" w:lineRule="exact"/>
-      </w:pPr>
     </w:p>
     <w:tbl>
       <w:tblPr>
@@ -4081,7 +3837,7 @@
           <w:b w:val="0"/>
           <w:i w:val="0"/>
         </w:rPr>
-        <w:t xml:space="preserve"> CoP/CoD/UoT. </w:t>
+        <w:t xml:space="preserve"> course of performance (CoP) / course of dealing (CoD) / usage of trade (UoT). </w:t>
       </w:r>
       <w:r>
         <w:rPr>
@@ -4137,7 +3893,7 @@
           <w:b w:val="0"/>
           <w:i w:val="0"/>
         </w:rPr>
-        <w:t xml:space="preserve"> (SOF, unconscionable term) than the agreement.</w:t>
+        <w:t xml:space="preserve"> (statute of frauds (SOF), unconscionable term) than the agreement.</w:t>
       </w:r>
     </w:p>
     <w:p>
@@ -8523,7 +8279,7 @@
                 <w:i w:val="0"/>
                 <w:sz w:val="21"/>
               </w:rPr>
-              <w:t xml:space="preserve"> (NOM clause) is enforceable — but on a </w:t>
+              <w:t xml:space="preserve"> (no-oral-modification (NOM) clause) is enforceable — but on a </w:t>
             </w:r>
             <w:r>
               <w:rPr>
@@ -34778,1999 +34534,6 @@
         </w:tc>
       </w:tr>
     </w:tbl>
-    <w:p>
-      <w:pPr>
-        <w:spacing w:after="0" w:line="120" w:lineRule="exact"/>
-      </w:pPr>
-    </w:p>
-    <w:tbl>
-      <w:tblPr>
-        <w:tblW w:type="auto" w:w="0"/>
-        <w:tblLook w:firstColumn="1" w:firstRow="1" w:lastColumn="0" w:lastRow="0" w:noHBand="0" w:noVBand="1" w:val="04A0"/>
-        <w:tblW w:w="5000" w:type="pct"/>
-        <w:tblBorders>
-          <w:top w:val="nil"/>
-          <w:left w:val="nil"/>
-          <w:bottom w:val="nil"/>
-          <w:right w:val="nil"/>
-          <w:insideH w:val="nil"/>
-          <w:insideV w:val="nil"/>
-        </w:tblBorders>
-      </w:tblPr>
-      <w:tblGrid>
-        <w:gridCol w:w="10512"/>
-      </w:tblGrid>
-      <w:tr>
-        <w:trPr>
-          <w:cantSplit w:val="true"/>
-        </w:trPr>
-        <w:tc>
-          <w:tcPr>
-            <w:tcW w:type="dxa" w:w="10512"/>
-            <w:shd w:val="clear" w:color="auto" w:fill="1F3A5F"/>
-            <w:tcMar>
-              <w:top w:w="70" w:type="dxa"/>
-              <w:bottom w:w="70" w:type="dxa"/>
-              <w:left w:w="140" w:type="dxa"/>
-              <w:right w:w="140" w:type="dxa"/>
-            </w:tcMar>
-            <w:tcBorders>
-              <w:left w:val="single" w:sz="36" w:space="0" w:color="C9A227"/>
-            </w:tcBorders>
-          </w:tcPr>
-          <w:p>
-            <w:pPr>
-              <w:keepNext/>
-              <w:spacing w:after="0"/>
-            </w:pPr>
-            <w:r>
-              <w:rPr>
-                <w:b/>
-                <w:i w:val="0"/>
-                <w:color w:val="FFFFFF"/>
-                <w:sz w:val="26"/>
-              </w:rPr>
-              <w:t>XVII. Rapid Review</w:t>
-            </w:r>
-          </w:p>
-        </w:tc>
-      </w:tr>
-    </w:tbl>
-    <w:p>
-      <w:pPr>
-        <w:keepNext/>
-        <w:spacing w:after="0" w:line="80" w:lineRule="exact"/>
-      </w:pPr>
-    </w:p>
-    <w:tbl>
-      <w:tblPr>
-        <w:tblStyle w:val="TableGrid"/>
-        <w:tblW w:type="auto" w:w="0"/>
-        <w:jc w:val="center"/>
-        <w:tblLayout w:type="fixed"/>
-        <w:tblLook w:firstColumn="1" w:firstRow="1" w:lastColumn="0" w:lastRow="0" w:noHBand="0" w:noVBand="1" w:val="04A0"/>
-        <w:tblW w:w="5000" w:type="pct"/>
-        <w:tblBorders>
-          <w:top w:val="single" w:sz="4" w:space="0" w:color="BFCCDD"/>
-          <w:left w:val="single" w:sz="4" w:space="0" w:color="BFCCDD"/>
-          <w:bottom w:val="single" w:sz="4" w:space="0" w:color="BFCCDD"/>
-          <w:right w:val="single" w:sz="4" w:space="0" w:color="BFCCDD"/>
-          <w:insideH w:val="single" w:sz="4" w:space="0" w:color="BFCCDD"/>
-          <w:insideV w:val="single" w:sz="4" w:space="0" w:color="BFCCDD"/>
-        </w:tblBorders>
-        <w:tblLayout w:type="fixed"/>
-      </w:tblPr>
-      <w:tblGrid>
-        <w:gridCol w:w="1854"/>
-        <w:gridCol w:w="8657"/>
-      </w:tblGrid>
-      <w:tr>
-        <w:trPr>
-          <w:tblHeader w:val="true"/>
-        </w:trPr>
-        <w:tc>
-          <w:tcPr>
-            <w:tcW w:type="dxa" w:w="1855"/>
-            <w:shd w:val="clear" w:color="auto" w:fill="1F3A5F"/>
-            <w:tcMar>
-              <w:top w:w="40" w:type="dxa"/>
-              <w:bottom w:w="40" w:type="dxa"/>
-              <w:left w:w="80" w:type="dxa"/>
-              <w:right w:w="80" w:type="dxa"/>
-            </w:tcMar>
-          </w:tcPr>
-          <w:p>
-            <w:pPr>
-              <w:spacing w:after="0"/>
-            </w:pPr>
-            <w:r>
-              <w:rPr>
-                <w:b/>
-                <w:i w:val="0"/>
-                <w:color w:val="FFFFFF"/>
-                <w:sz w:val="20"/>
-              </w:rPr>
-              <w:t>Number to know</w:t>
-            </w:r>
-          </w:p>
-        </w:tc>
-        <w:tc>
-          <w:tcPr>
-            <w:tcW w:type="dxa" w:w="8657"/>
-            <w:shd w:val="clear" w:color="auto" w:fill="1F3A5F"/>
-            <w:tcMar>
-              <w:top w:w="40" w:type="dxa"/>
-              <w:bottom w:w="40" w:type="dxa"/>
-              <w:left w:w="80" w:type="dxa"/>
-              <w:right w:w="80" w:type="dxa"/>
-            </w:tcMar>
-          </w:tcPr>
-          <w:p>
-            <w:pPr>
-              <w:spacing w:after="0"/>
-            </w:pPr>
-            <w:r>
-              <w:rPr>
-                <w:b/>
-                <w:i w:val="0"/>
-                <w:color w:val="FFFFFF"/>
-                <w:sz w:val="20"/>
-              </w:rPr>
-              <w:t>Rule</w:t>
-            </w:r>
-          </w:p>
-        </w:tc>
-      </w:tr>
-      <w:tr>
-        <w:trPr>
-          <w:cantSplit w:val="true"/>
-        </w:trPr>
-        <w:tc>
-          <w:tcPr>
-            <w:tcW w:type="dxa" w:w="1855"/>
-            <w:tcMar>
-              <w:top w:w="30" w:type="dxa"/>
-              <w:bottom w:w="30" w:type="dxa"/>
-              <w:left w:w="80" w:type="dxa"/>
-              <w:right w:w="80" w:type="dxa"/>
-            </w:tcMar>
-          </w:tcPr>
-          <w:p>
-            <w:pPr>
-              <w:spacing w:after="0" w:line="240" w:lineRule="auto"/>
-            </w:pPr>
-            <w:r>
-              <w:rPr>
-                <w:b/>
-                <w:i w:val="0"/>
-                <w:sz w:val="20"/>
-              </w:rPr>
-              <w:t>$500+</w:t>
-            </w:r>
-          </w:p>
-        </w:tc>
-        <w:tc>
-          <w:tcPr>
-            <w:tcW w:type="dxa" w:w="8657"/>
-            <w:tcMar>
-              <w:top w:w="30" w:type="dxa"/>
-              <w:bottom w:w="30" w:type="dxa"/>
-              <w:left w:w="80" w:type="dxa"/>
-              <w:right w:w="80" w:type="dxa"/>
-            </w:tcMar>
-          </w:tcPr>
-          <w:p>
-            <w:pPr>
-              <w:spacing w:after="0" w:line="240" w:lineRule="auto"/>
-            </w:pPr>
-            <w:r>
-              <w:rPr>
-                <w:b w:val="0"/>
-                <w:i w:val="0"/>
-                <w:sz w:val="20"/>
-              </w:rPr>
-              <w:t>Statute of frauds applies (§ 2-201)</w:t>
-            </w:r>
-          </w:p>
-        </w:tc>
-      </w:tr>
-      <w:tr>
-        <w:trPr>
-          <w:cantSplit w:val="true"/>
-        </w:trPr>
-        <w:tc>
-          <w:tcPr>
-            <w:tcW w:type="dxa" w:w="1855"/>
-            <w:tcMar>
-              <w:top w:w="30" w:type="dxa"/>
-              <w:bottom w:w="30" w:type="dxa"/>
-              <w:left w:w="80" w:type="dxa"/>
-              <w:right w:w="80" w:type="dxa"/>
-            </w:tcMar>
-            <w:shd w:val="clear" w:color="auto" w:fill="F2F6FB"/>
-          </w:tcPr>
-          <w:p>
-            <w:pPr>
-              <w:spacing w:after="0" w:line="240" w:lineRule="auto"/>
-            </w:pPr>
-            <w:r>
-              <w:rPr>
-                <w:b/>
-                <w:i w:val="0"/>
-                <w:sz w:val="20"/>
-              </w:rPr>
-              <w:t>10 days</w:t>
-            </w:r>
-          </w:p>
-        </w:tc>
-        <w:tc>
-          <w:tcPr>
-            <w:tcW w:type="dxa" w:w="8657"/>
-            <w:tcMar>
-              <w:top w:w="30" w:type="dxa"/>
-              <w:bottom w:w="30" w:type="dxa"/>
-              <w:left w:w="80" w:type="dxa"/>
-              <w:right w:w="80" w:type="dxa"/>
-            </w:tcMar>
-            <w:shd w:val="clear" w:color="auto" w:fill="F2F6FB"/>
-          </w:tcPr>
-          <w:p>
-            <w:pPr>
-              <w:spacing w:after="0" w:line="240" w:lineRule="auto"/>
-            </w:pPr>
-            <w:r>
-              <w:rPr>
-                <w:b w:val="0"/>
-                <w:i w:val="0"/>
-                <w:sz w:val="20"/>
-              </w:rPr>
-              <w:t>Merchant must object in writing to a confirmation (§ 2-201(2)); seller's reclamation demand after insolvent buyer receives goods (§ 2-702(2))</w:t>
-            </w:r>
-          </w:p>
-        </w:tc>
-      </w:tr>
-      <w:tr>
-        <w:trPr>
-          <w:cantSplit w:val="true"/>
-        </w:trPr>
-        <w:tc>
-          <w:tcPr>
-            <w:tcW w:type="dxa" w:w="1855"/>
-            <w:tcMar>
-              <w:top w:w="30" w:type="dxa"/>
-              <w:bottom w:w="30" w:type="dxa"/>
-              <w:left w:w="80" w:type="dxa"/>
-              <w:right w:w="80" w:type="dxa"/>
-            </w:tcMar>
-          </w:tcPr>
-          <w:p>
-            <w:pPr>
-              <w:spacing w:after="0" w:line="240" w:lineRule="auto"/>
-            </w:pPr>
-            <w:r>
-              <w:rPr>
-                <w:b/>
-                <w:i w:val="0"/>
-                <w:sz w:val="20"/>
-              </w:rPr>
-              <w:t>3 months</w:t>
-            </w:r>
-          </w:p>
-        </w:tc>
-        <w:tc>
-          <w:tcPr>
-            <w:tcW w:type="dxa" w:w="8657"/>
-            <w:tcMar>
-              <w:top w:w="30" w:type="dxa"/>
-              <w:bottom w:w="30" w:type="dxa"/>
-              <w:left w:w="80" w:type="dxa"/>
-              <w:right w:w="80" w:type="dxa"/>
-            </w:tcMar>
-          </w:tcPr>
-          <w:p>
-            <w:pPr>
-              <w:spacing w:after="0" w:line="240" w:lineRule="auto"/>
-            </w:pPr>
-            <w:r>
-              <w:rPr>
-                <w:b w:val="0"/>
-                <w:i w:val="0"/>
-                <w:sz w:val="20"/>
-              </w:rPr>
-              <w:t>Maximum life of a firm offer without consideration (§ 2-205)</w:t>
-            </w:r>
-          </w:p>
-        </w:tc>
-      </w:tr>
-      <w:tr>
-        <w:trPr>
-          <w:cantSplit w:val="true"/>
-        </w:trPr>
-        <w:tc>
-          <w:tcPr>
-            <w:tcW w:type="dxa" w:w="1855"/>
-            <w:tcMar>
-              <w:top w:w="30" w:type="dxa"/>
-              <w:bottom w:w="30" w:type="dxa"/>
-              <w:left w:w="80" w:type="dxa"/>
-              <w:right w:w="80" w:type="dxa"/>
-            </w:tcMar>
-            <w:shd w:val="clear" w:color="auto" w:fill="F2F6FB"/>
-          </w:tcPr>
-          <w:p>
-            <w:pPr>
-              <w:spacing w:after="0" w:line="240" w:lineRule="auto"/>
-            </w:pPr>
-            <w:r>
-              <w:rPr>
-                <w:b/>
-                <w:i w:val="0"/>
-                <w:sz w:val="20"/>
-              </w:rPr>
-              <w:t>30 days</w:t>
-            </w:r>
-          </w:p>
-        </w:tc>
-        <w:tc>
-          <w:tcPr>
-            <w:tcW w:type="dxa" w:w="8657"/>
-            <w:tcMar>
-              <w:top w:w="30" w:type="dxa"/>
-              <w:bottom w:w="30" w:type="dxa"/>
-              <w:left w:w="80" w:type="dxa"/>
-              <w:right w:w="80" w:type="dxa"/>
-            </w:tcMar>
-            <w:shd w:val="clear" w:color="auto" w:fill="F2F6FB"/>
-          </w:tcPr>
-          <w:p>
-            <w:pPr>
-              <w:spacing w:after="0" w:line="240" w:lineRule="auto"/>
-            </w:pPr>
-            <w:r>
-              <w:rPr>
-                <w:b w:val="0"/>
-                <w:i w:val="0"/>
-                <w:sz w:val="20"/>
-              </w:rPr>
-              <w:t>Max time to give adequate assurance (§ 2-609(4)); buyer's time to respond to an excuse notice (§ 2-616(2))</w:t>
-            </w:r>
-          </w:p>
-        </w:tc>
-      </w:tr>
-      <w:tr>
-        <w:trPr>
-          <w:cantSplit w:val="true"/>
-        </w:trPr>
-        <w:tc>
-          <w:tcPr>
-            <w:tcW w:type="dxa" w:w="1855"/>
-            <w:tcMar>
-              <w:top w:w="30" w:type="dxa"/>
-              <w:bottom w:w="30" w:type="dxa"/>
-              <w:left w:w="80" w:type="dxa"/>
-              <w:right w:w="80" w:type="dxa"/>
-            </w:tcMar>
-          </w:tcPr>
-          <w:p>
-            <w:pPr>
-              <w:spacing w:after="0" w:line="240" w:lineRule="auto"/>
-            </w:pPr>
-            <w:r>
-              <w:rPr>
-                <w:b/>
-                <w:i w:val="0"/>
-                <w:sz w:val="20"/>
-              </w:rPr>
-              <w:t>4 years</w:t>
-            </w:r>
-          </w:p>
-        </w:tc>
-        <w:tc>
-          <w:tcPr>
-            <w:tcW w:type="dxa" w:w="8657"/>
-            <w:tcMar>
-              <w:top w:w="30" w:type="dxa"/>
-              <w:bottom w:w="30" w:type="dxa"/>
-              <w:left w:w="80" w:type="dxa"/>
-              <w:right w:w="80" w:type="dxa"/>
-            </w:tcMar>
-          </w:tcPr>
-          <w:p>
-            <w:pPr>
-              <w:spacing w:after="0" w:line="240" w:lineRule="auto"/>
-            </w:pPr>
-            <w:r>
-              <w:rPr>
-                <w:b w:val="0"/>
-                <w:i w:val="0"/>
-                <w:sz w:val="20"/>
-              </w:rPr>
-              <w:t xml:space="preserve">Statute of limitations; can shorten to </w:t>
-            </w:r>
-            <w:r>
-              <w:rPr>
-                <w:b/>
-                <w:i w:val="0"/>
-                <w:sz w:val="20"/>
-              </w:rPr>
-              <w:t>1 year</w:t>
-            </w:r>
-            <w:r>
-              <w:rPr>
-                <w:b w:val="0"/>
-                <w:i w:val="0"/>
-                <w:sz w:val="20"/>
-              </w:rPr>
-              <w:t xml:space="preserve">, never extend; warranty breach accrues on </w:t>
-            </w:r>
-            <w:r>
-              <w:rPr>
-                <w:b/>
-                <w:i w:val="0"/>
-                <w:sz w:val="20"/>
-              </w:rPr>
-              <w:t>tender</w:t>
-            </w:r>
-            <w:r>
-              <w:rPr>
-                <w:b w:val="0"/>
-                <w:i w:val="0"/>
-                <w:sz w:val="20"/>
-              </w:rPr>
-              <w:t xml:space="preserve"> (§ 2-725)</w:t>
-            </w:r>
-          </w:p>
-        </w:tc>
-      </w:tr>
-      <w:tr>
-        <w:trPr>
-          <w:cantSplit w:val="true"/>
-        </w:trPr>
-        <w:tc>
-          <w:tcPr>
-            <w:tcW w:type="dxa" w:w="1855"/>
-            <w:tcMar>
-              <w:top w:w="30" w:type="dxa"/>
-              <w:bottom w:w="30" w:type="dxa"/>
-              <w:left w:w="80" w:type="dxa"/>
-              <w:right w:w="80" w:type="dxa"/>
-            </w:tcMar>
-            <w:shd w:val="clear" w:color="auto" w:fill="F2F6FB"/>
-          </w:tcPr>
-          <w:p>
-            <w:pPr>
-              <w:spacing w:after="0" w:line="240" w:lineRule="auto"/>
-            </w:pPr>
-            <w:r>
-              <w:rPr>
-                <w:b/>
-                <w:i w:val="0"/>
-                <w:sz w:val="20"/>
-              </w:rPr>
-              <w:t>20% or $500</w:t>
-            </w:r>
-          </w:p>
-        </w:tc>
-        <w:tc>
-          <w:tcPr>
-            <w:tcW w:type="dxa" w:w="8657"/>
-            <w:tcMar>
-              <w:top w:w="30" w:type="dxa"/>
-              <w:bottom w:w="30" w:type="dxa"/>
-              <w:left w:w="80" w:type="dxa"/>
-              <w:right w:w="80" w:type="dxa"/>
-            </w:tcMar>
-            <w:shd w:val="clear" w:color="auto" w:fill="F2F6FB"/>
-          </w:tcPr>
-          <w:p>
-            <w:pPr>
-              <w:spacing w:after="0" w:line="240" w:lineRule="auto"/>
-            </w:pPr>
-            <w:r>
-              <w:rPr>
-                <w:b w:val="0"/>
-                <w:i w:val="0"/>
-                <w:sz w:val="20"/>
-              </w:rPr>
-              <w:t>Smaller of the two is what a seller may keep from a breaching buyer's deposit absent LD (§ 2-718(2))</w:t>
-            </w:r>
-          </w:p>
-        </w:tc>
-      </w:tr>
-    </w:tbl>
-    <w:p>
-      <w:pPr>
-        <w:spacing w:after="0" w:line="120" w:lineRule="exact"/>
-      </w:pPr>
-    </w:p>
-    <w:tbl>
-      <w:tblPr>
-        <w:tblStyle w:val="TableGrid"/>
-        <w:tblW w:type="auto" w:w="0"/>
-        <w:jc w:val="center"/>
-        <w:tblLayout w:type="fixed"/>
-        <w:tblLook w:firstColumn="1" w:firstRow="1" w:lastColumn="0" w:lastRow="0" w:noHBand="0" w:noVBand="1" w:val="04A0"/>
-        <w:tblW w:w="5000" w:type="pct"/>
-        <w:tblBorders>
-          <w:top w:val="single" w:sz="4" w:space="0" w:color="BFCCDD"/>
-          <w:left w:val="single" w:sz="4" w:space="0" w:color="BFCCDD"/>
-          <w:bottom w:val="single" w:sz="4" w:space="0" w:color="BFCCDD"/>
-          <w:right w:val="single" w:sz="4" w:space="0" w:color="BFCCDD"/>
-          <w:insideH w:val="single" w:sz="4" w:space="0" w:color="BFCCDD"/>
-          <w:insideV w:val="single" w:sz="4" w:space="0" w:color="BFCCDD"/>
-        </w:tblBorders>
-        <w:tblLayout w:type="fixed"/>
-      </w:tblPr>
-      <w:tblGrid>
-        <w:gridCol w:w="6064"/>
-        <w:gridCol w:w="4447"/>
-      </w:tblGrid>
-      <w:tr>
-        <w:trPr>
-          <w:tblHeader w:val="true"/>
-        </w:trPr>
-        <w:tc>
-          <w:tcPr>
-            <w:tcW w:type="dxa" w:w="6064"/>
-            <w:shd w:val="clear" w:color="auto" w:fill="1F3A5F"/>
-            <w:tcMar>
-              <w:top w:w="40" w:type="dxa"/>
-              <w:bottom w:w="40" w:type="dxa"/>
-              <w:left w:w="80" w:type="dxa"/>
-              <w:right w:w="80" w:type="dxa"/>
-            </w:tcMar>
-          </w:tcPr>
-          <w:p>
-            <w:pPr>
-              <w:spacing w:after="0"/>
-            </w:pPr>
-            <w:r>
-              <w:rPr>
-                <w:b/>
-                <w:i w:val="0"/>
-                <w:color w:val="FFFFFF"/>
-                <w:sz w:val="20"/>
-              </w:rPr>
-              <w:t>Rule</w:t>
-            </w:r>
-          </w:p>
-        </w:tc>
-        <w:tc>
-          <w:tcPr>
-            <w:tcW w:type="dxa" w:w="4448"/>
-            <w:shd w:val="clear" w:color="auto" w:fill="1F3A5F"/>
-            <w:tcMar>
-              <w:top w:w="40" w:type="dxa"/>
-              <w:bottom w:w="40" w:type="dxa"/>
-              <w:left w:w="80" w:type="dxa"/>
-              <w:right w:w="80" w:type="dxa"/>
-            </w:tcMar>
-          </w:tcPr>
-          <w:p>
-            <w:pPr>
-              <w:spacing w:after="0"/>
-            </w:pPr>
-            <w:r>
-              <w:rPr>
-                <w:b/>
-                <w:i w:val="0"/>
-                <w:color w:val="FFFFFF"/>
-                <w:sz w:val="20"/>
-              </w:rPr>
-              <w:t>Who must be a merchant</w:t>
-            </w:r>
-          </w:p>
-        </w:tc>
-      </w:tr>
-      <w:tr>
-        <w:trPr>
-          <w:cantSplit w:val="true"/>
-        </w:trPr>
-        <w:tc>
-          <w:tcPr>
-            <w:tcW w:type="dxa" w:w="6064"/>
-            <w:tcMar>
-              <w:top w:w="30" w:type="dxa"/>
-              <w:bottom w:w="30" w:type="dxa"/>
-              <w:left w:w="80" w:type="dxa"/>
-              <w:right w:w="80" w:type="dxa"/>
-            </w:tcMar>
-          </w:tcPr>
-          <w:p>
-            <w:pPr>
-              <w:spacing w:after="0" w:line="240" w:lineRule="auto"/>
-            </w:pPr>
-            <w:r>
-              <w:rPr>
-                <w:b w:val="0"/>
-                <w:i w:val="0"/>
-                <w:sz w:val="20"/>
-              </w:rPr>
-              <w:t>Firm offer (§ 2-205)</w:t>
-            </w:r>
-          </w:p>
-        </w:tc>
-        <w:tc>
-          <w:tcPr>
-            <w:tcW w:type="dxa" w:w="4448"/>
-            <w:tcMar>
-              <w:top w:w="30" w:type="dxa"/>
-              <w:bottom w:w="30" w:type="dxa"/>
-              <w:left w:w="80" w:type="dxa"/>
-              <w:right w:w="80" w:type="dxa"/>
-            </w:tcMar>
-          </w:tcPr>
-          <w:p>
-            <w:pPr>
-              <w:spacing w:after="0" w:line="240" w:lineRule="auto"/>
-            </w:pPr>
-            <w:r>
-              <w:rPr>
-                <w:b/>
-                <w:i w:val="0"/>
-                <w:sz w:val="20"/>
-              </w:rPr>
-              <w:t>Offeror</w:t>
-            </w:r>
-            <w:r>
-              <w:rPr>
-                <w:b w:val="0"/>
-                <w:i w:val="0"/>
-                <w:sz w:val="20"/>
-              </w:rPr>
-              <w:t xml:space="preserve"> (any business person)</w:t>
-            </w:r>
-          </w:p>
-        </w:tc>
-      </w:tr>
-      <w:tr>
-        <w:trPr>
-          <w:cantSplit w:val="true"/>
-        </w:trPr>
-        <w:tc>
-          <w:tcPr>
-            <w:tcW w:type="dxa" w:w="6064"/>
-            <w:tcMar>
-              <w:top w:w="30" w:type="dxa"/>
-              <w:bottom w:w="30" w:type="dxa"/>
-              <w:left w:w="80" w:type="dxa"/>
-              <w:right w:w="80" w:type="dxa"/>
-            </w:tcMar>
-            <w:shd w:val="clear" w:color="auto" w:fill="F2F6FB"/>
-          </w:tcPr>
-          <w:p>
-            <w:pPr>
-              <w:spacing w:after="0" w:line="240" w:lineRule="auto"/>
-            </w:pPr>
-            <w:r>
-              <w:rPr>
-                <w:b w:val="0"/>
-                <w:i w:val="0"/>
-                <w:sz w:val="20"/>
-              </w:rPr>
-              <w:t>§ 2-207(2) added terms; § 2-201(2) confirmation</w:t>
-            </w:r>
-          </w:p>
-        </w:tc>
-        <w:tc>
-          <w:tcPr>
-            <w:tcW w:type="dxa" w:w="4448"/>
-            <w:tcMar>
-              <w:top w:w="30" w:type="dxa"/>
-              <w:bottom w:w="30" w:type="dxa"/>
-              <w:left w:w="80" w:type="dxa"/>
-              <w:right w:w="80" w:type="dxa"/>
-            </w:tcMar>
-            <w:shd w:val="clear" w:color="auto" w:fill="F2F6FB"/>
-          </w:tcPr>
-          <w:p>
-            <w:pPr>
-              <w:spacing w:after="0" w:line="240" w:lineRule="auto"/>
-            </w:pPr>
-            <w:r>
-              <w:rPr>
-                <w:b/>
-                <w:i w:val="0"/>
-                <w:sz w:val="20"/>
-              </w:rPr>
-              <w:t>Both</w:t>
-            </w:r>
-            <w:r>
-              <w:rPr>
-                <w:b w:val="0"/>
-                <w:i w:val="0"/>
-                <w:sz w:val="20"/>
-              </w:rPr>
-              <w:t xml:space="preserve"> parties</w:t>
-            </w:r>
-          </w:p>
-        </w:tc>
-      </w:tr>
-      <w:tr>
-        <w:trPr>
-          <w:cantSplit w:val="true"/>
-        </w:trPr>
-        <w:tc>
-          <w:tcPr>
-            <w:tcW w:type="dxa" w:w="6064"/>
-            <w:tcMar>
-              <w:top w:w="30" w:type="dxa"/>
-              <w:bottom w:w="30" w:type="dxa"/>
-              <w:left w:w="80" w:type="dxa"/>
-              <w:right w:w="80" w:type="dxa"/>
-            </w:tcMar>
-          </w:tcPr>
-          <w:p>
-            <w:pPr>
-              <w:spacing w:after="0" w:line="240" w:lineRule="auto"/>
-            </w:pPr>
-            <w:r>
-              <w:rPr>
-                <w:b w:val="0"/>
-                <w:i w:val="0"/>
-                <w:sz w:val="20"/>
-              </w:rPr>
-              <w:t>NOM clause separately signed (§ 2-209(2))</w:t>
-            </w:r>
-          </w:p>
-        </w:tc>
-        <w:tc>
-          <w:tcPr>
-            <w:tcW w:type="dxa" w:w="4448"/>
-            <w:tcMar>
-              <w:top w:w="30" w:type="dxa"/>
-              <w:bottom w:w="30" w:type="dxa"/>
-              <w:left w:w="80" w:type="dxa"/>
-              <w:right w:w="80" w:type="dxa"/>
-            </w:tcMar>
-          </w:tcPr>
-          <w:p>
-            <w:pPr>
-              <w:spacing w:after="0" w:line="240" w:lineRule="auto"/>
-            </w:pPr>
-            <w:r>
-              <w:rPr>
-                <w:b w:val="0"/>
-                <w:i w:val="0"/>
-                <w:sz w:val="20"/>
-              </w:rPr>
-              <w:t xml:space="preserve">Required when a merchant's form goes to a </w:t>
-            </w:r>
-            <w:r>
-              <w:rPr>
-                <w:b/>
-                <w:i w:val="0"/>
-                <w:sz w:val="20"/>
-              </w:rPr>
-              <w:t>non-merchant</w:t>
-            </w:r>
-          </w:p>
-        </w:tc>
-      </w:tr>
-      <w:tr>
-        <w:trPr>
-          <w:cantSplit w:val="true"/>
-        </w:trPr>
-        <w:tc>
-          <w:tcPr>
-            <w:tcW w:type="dxa" w:w="6064"/>
-            <w:tcMar>
-              <w:top w:w="30" w:type="dxa"/>
-              <w:bottom w:w="30" w:type="dxa"/>
-              <w:left w:w="80" w:type="dxa"/>
-              <w:right w:w="80" w:type="dxa"/>
-            </w:tcMar>
-            <w:shd w:val="clear" w:color="auto" w:fill="F2F6FB"/>
-          </w:tcPr>
-          <w:p>
-            <w:pPr>
-              <w:spacing w:after="0" w:line="240" w:lineRule="auto"/>
-            </w:pPr>
-            <w:r>
-              <w:rPr>
-                <w:b w:val="0"/>
-                <w:i w:val="0"/>
-                <w:sz w:val="20"/>
-              </w:rPr>
-              <w:t>Merchantability (§ 2-314) · infringement (§ 2-312(3)) · entrustment (§ 2-403(2))</w:t>
-            </w:r>
-          </w:p>
-        </w:tc>
-        <w:tc>
-          <w:tcPr>
-            <w:tcW w:type="dxa" w:w="4448"/>
-            <w:tcMar>
-              <w:top w:w="30" w:type="dxa"/>
-              <w:bottom w:w="30" w:type="dxa"/>
-              <w:left w:w="80" w:type="dxa"/>
-              <w:right w:w="80" w:type="dxa"/>
-            </w:tcMar>
-            <w:shd w:val="clear" w:color="auto" w:fill="F2F6FB"/>
-          </w:tcPr>
-          <w:p>
-            <w:pPr>
-              <w:spacing w:after="0" w:line="240" w:lineRule="auto"/>
-            </w:pPr>
-            <w:r>
-              <w:rPr>
-                <w:b w:val="0"/>
-                <w:i w:val="0"/>
-                <w:sz w:val="20"/>
-              </w:rPr>
-              <w:t xml:space="preserve">Merchant </w:t>
-            </w:r>
-            <w:r>
-              <w:rPr>
-                <w:b/>
-                <w:i w:val="0"/>
-                <w:sz w:val="20"/>
-              </w:rPr>
-              <w:t>in goods of that kind</w:t>
-            </w:r>
-          </w:p>
-        </w:tc>
-      </w:tr>
-      <w:tr>
-        <w:trPr>
-          <w:cantSplit w:val="true"/>
-        </w:trPr>
-        <w:tc>
-          <w:tcPr>
-            <w:tcW w:type="dxa" w:w="6064"/>
-            <w:tcMar>
-              <w:top w:w="30" w:type="dxa"/>
-              <w:bottom w:w="30" w:type="dxa"/>
-              <w:left w:w="80" w:type="dxa"/>
-              <w:right w:w="80" w:type="dxa"/>
-            </w:tcMar>
-          </w:tcPr>
-          <w:p>
-            <w:pPr>
-              <w:spacing w:after="0" w:line="240" w:lineRule="auto"/>
-            </w:pPr>
-            <w:r>
-              <w:rPr>
-                <w:b w:val="0"/>
-                <w:i w:val="0"/>
-                <w:sz w:val="20"/>
-              </w:rPr>
-              <w:t>Risk on direct tender (§ 2-509(3))</w:t>
-            </w:r>
-          </w:p>
-        </w:tc>
-        <w:tc>
-          <w:tcPr>
-            <w:tcW w:type="dxa" w:w="4448"/>
-            <w:tcMar>
-              <w:top w:w="30" w:type="dxa"/>
-              <w:bottom w:w="30" w:type="dxa"/>
-              <w:left w:w="80" w:type="dxa"/>
-              <w:right w:w="80" w:type="dxa"/>
-            </w:tcMar>
-          </w:tcPr>
-          <w:p>
-            <w:pPr>
-              <w:spacing w:after="0" w:line="240" w:lineRule="auto"/>
-            </w:pPr>
-            <w:r>
-              <w:rPr>
-                <w:b w:val="0"/>
-                <w:i w:val="0"/>
-                <w:sz w:val="20"/>
-              </w:rPr>
-              <w:t xml:space="preserve">Merchant seller → </w:t>
-            </w:r>
-            <w:r>
-              <w:rPr>
-                <w:b/>
-                <w:i w:val="0"/>
-                <w:sz w:val="20"/>
-              </w:rPr>
-              <w:t>receipt</w:t>
-            </w:r>
-            <w:r>
-              <w:rPr>
-                <w:b w:val="0"/>
-                <w:i w:val="0"/>
-                <w:sz w:val="20"/>
-              </w:rPr>
-              <w:t xml:space="preserve">; non-merchant → </w:t>
-            </w:r>
-            <w:r>
-              <w:rPr>
-                <w:b/>
-                <w:i w:val="0"/>
-                <w:sz w:val="20"/>
-              </w:rPr>
-              <w:t>tender</w:t>
-            </w:r>
-          </w:p>
-        </w:tc>
-      </w:tr>
-      <w:tr>
-        <w:trPr>
-          <w:cantSplit w:val="true"/>
-        </w:trPr>
-        <w:tc>
-          <w:tcPr>
-            <w:tcW w:type="dxa" w:w="6064"/>
-            <w:tcMar>
-              <w:top w:w="30" w:type="dxa"/>
-              <w:bottom w:w="30" w:type="dxa"/>
-              <w:left w:w="80" w:type="dxa"/>
-              <w:right w:w="80" w:type="dxa"/>
-            </w:tcMar>
-            <w:shd w:val="clear" w:color="auto" w:fill="F2F6FB"/>
-          </w:tcPr>
-          <w:p>
-            <w:pPr>
-              <w:spacing w:after="0" w:line="240" w:lineRule="auto"/>
-            </w:pPr>
-            <w:r>
-              <w:rPr>
-                <w:b/>
-                <w:i w:val="0"/>
-                <w:sz w:val="20"/>
-              </w:rPr>
-              <w:t>Not required:</w:t>
-            </w:r>
-            <w:r>
-              <w:rPr>
-                <w:b w:val="0"/>
-                <w:i w:val="0"/>
-                <w:sz w:val="20"/>
-              </w:rPr>
-              <w:t xml:space="preserve"> Art. 2 scope · title · fitness · express warranties · § 2-209(1)</w:t>
-            </w:r>
-          </w:p>
-        </w:tc>
-        <w:tc>
-          <w:tcPr>
-            <w:tcW w:type="dxa" w:w="4448"/>
-            <w:tcMar>
-              <w:top w:w="30" w:type="dxa"/>
-              <w:bottom w:w="30" w:type="dxa"/>
-              <w:left w:w="80" w:type="dxa"/>
-              <w:right w:w="80" w:type="dxa"/>
-            </w:tcMar>
-            <w:shd w:val="clear" w:color="auto" w:fill="F2F6FB"/>
-          </w:tcPr>
-          <w:p>
-            <w:pPr>
-              <w:spacing w:after="0" w:line="240" w:lineRule="auto"/>
-            </w:pPr>
-            <w:r>
-              <w:rPr>
-                <w:b w:val="0"/>
-                <w:i w:val="0"/>
-                <w:sz w:val="20"/>
-              </w:rPr>
-              <w:t>—</w:t>
-            </w:r>
-          </w:p>
-        </w:tc>
-      </w:tr>
-    </w:tbl>
-    <w:p>
-      <w:pPr>
-        <w:spacing w:after="0" w:line="120" w:lineRule="exact"/>
-      </w:pPr>
-    </w:p>
-    <w:tbl>
-      <w:tblPr>
-        <w:tblW w:type="auto" w:w="0"/>
-        <w:tblLook w:firstColumn="1" w:firstRow="1" w:lastColumn="0" w:lastRow="0" w:noHBand="0" w:noVBand="1" w:val="04A0"/>
-        <w:tblW w:w="5000" w:type="pct"/>
-        <w:tblBorders>
-          <w:top w:val="nil"/>
-          <w:left w:val="nil"/>
-          <w:bottom w:val="nil"/>
-          <w:right w:val="nil"/>
-          <w:insideH w:val="nil"/>
-          <w:insideV w:val="nil"/>
-        </w:tblBorders>
-      </w:tblPr>
-      <w:tblGrid>
-        <w:gridCol w:w="10512"/>
-      </w:tblGrid>
-      <w:tr>
-        <w:tc>
-          <w:tcPr>
-            <w:tcW w:type="dxa" w:w="10512"/>
-            <w:shd w:val="clear" w:color="auto" w:fill="FFF5E1"/>
-            <w:tcMar>
-              <w:top w:w="70" w:type="dxa"/>
-              <w:bottom w:w="70" w:type="dxa"/>
-              <w:left w:w="140" w:type="dxa"/>
-              <w:right w:w="120" w:type="dxa"/>
-            </w:tcMar>
-            <w:tcBorders>
-              <w:left w:val="single" w:sz="30" w:space="0" w:color="C77700"/>
-            </w:tcBorders>
-          </w:tcPr>
-          <w:p>
-            <w:pPr>
-              <w:spacing w:after="30" w:line="240" w:lineRule="auto"/>
-            </w:pPr>
-            <w:r>
-              <w:rPr>
-                <w:b/>
-                <w:color w:val="C77700"/>
-                <w:sz w:val="15"/>
-              </w:rPr>
-              <w:t xml:space="preserve">EXAM TIPS   </w:t>
-            </w:r>
-            <w:r>
-              <w:rPr>
-                <w:b/>
-                <w:i w:val="0"/>
-                <w:sz w:val="21"/>
-              </w:rPr>
-              <w:t>Top traps</w:t>
-            </w:r>
-          </w:p>
-          <w:p>
-            <w:pPr>
-              <w:spacing w:after="30" w:line="240" w:lineRule="auto"/>
-              <w:ind w:left="288" w:hanging="202"/>
-            </w:pPr>
-            <w:r>
-              <w:rPr>
-                <w:color w:val="C77700"/>
-                <w:sz w:val="21"/>
-              </w:rPr>
-              <w:t xml:space="preserve">•  </w:t>
-            </w:r>
-            <w:r>
-              <w:rPr>
-                <w:b w:val="0"/>
-                <w:i w:val="0"/>
-                <w:sz w:val="21"/>
-              </w:rPr>
-              <w:t xml:space="preserve">Art. 2 covers </w:t>
-            </w:r>
-            <w:r>
-              <w:rPr>
-                <w:b/>
-                <w:i w:val="0"/>
-                <w:sz w:val="21"/>
-              </w:rPr>
-              <w:t>consumer-to-consumer</w:t>
-            </w:r>
-            <w:r>
-              <w:rPr>
-                <w:b w:val="0"/>
-                <w:i w:val="0"/>
-                <w:sz w:val="21"/>
-              </w:rPr>
-              <w:t xml:space="preserve"> sales; merchant status matters only for specific rules.</w:t>
-            </w:r>
-          </w:p>
-          <w:p>
-            <w:pPr>
-              <w:spacing w:after="30" w:line="240" w:lineRule="auto"/>
-              <w:ind w:left="288" w:hanging="202"/>
-            </w:pPr>
-            <w:r>
-              <w:rPr>
-                <w:color w:val="C77700"/>
-                <w:sz w:val="21"/>
-              </w:rPr>
-              <w:t xml:space="preserve">•  </w:t>
-            </w:r>
-            <w:r>
-              <w:rPr>
-                <w:b w:val="0"/>
-                <w:i w:val="0"/>
-                <w:sz w:val="21"/>
-              </w:rPr>
-              <w:t xml:space="preserve">Minerals/structures are goods only if the </w:t>
-            </w:r>
-            <w:r>
-              <w:rPr>
-                <w:b/>
-                <w:i w:val="0"/>
-                <w:sz w:val="21"/>
-              </w:rPr>
-              <w:t>seller</w:t>
-            </w:r>
-            <w:r>
-              <w:rPr>
-                <w:b w:val="0"/>
-                <w:i w:val="0"/>
-                <w:sz w:val="21"/>
-              </w:rPr>
-              <w:t xml:space="preserve"> severs; timber and crops either way.</w:t>
-            </w:r>
-          </w:p>
-          <w:p>
-            <w:pPr>
-              <w:spacing w:after="30" w:line="240" w:lineRule="auto"/>
-              <w:ind w:left="288" w:hanging="202"/>
-            </w:pPr>
-            <w:r>
-              <w:rPr>
-                <w:color w:val="C77700"/>
-                <w:sz w:val="21"/>
-              </w:rPr>
-              <w:t xml:space="preserve">•  </w:t>
-            </w:r>
-            <w:r>
-              <w:rPr>
-                <w:b w:val="0"/>
-                <w:i w:val="0"/>
-                <w:sz w:val="21"/>
-              </w:rPr>
-              <w:t xml:space="preserve">Firm offer: only the </w:t>
-            </w:r>
-            <w:r>
-              <w:rPr>
-                <w:b/>
-                <w:i w:val="0"/>
-                <w:sz w:val="21"/>
-              </w:rPr>
-              <w:t>offeror</w:t>
-            </w:r>
-            <w:r>
-              <w:rPr>
-                <w:b w:val="0"/>
-                <w:i w:val="0"/>
-                <w:sz w:val="21"/>
-              </w:rPr>
-              <w:t xml:space="preserve"> must be a merchant; </w:t>
-            </w:r>
-            <w:r>
-              <w:rPr>
-                <w:b/>
-                <w:i w:val="0"/>
-                <w:sz w:val="21"/>
-              </w:rPr>
-              <w:t>3-month</w:t>
-            </w:r>
-            <w:r>
-              <w:rPr>
-                <w:b w:val="0"/>
-                <w:i w:val="0"/>
-                <w:sz w:val="21"/>
-              </w:rPr>
-              <w:t xml:space="preserve"> cap; offeree's form → separately signed.</w:t>
-            </w:r>
-          </w:p>
-          <w:p>
-            <w:pPr>
-              <w:spacing w:after="30" w:line="240" w:lineRule="auto"/>
-              <w:ind w:left="288" w:hanging="202"/>
-            </w:pPr>
-            <w:r>
-              <w:rPr>
-                <w:color w:val="C77700"/>
-                <w:sz w:val="21"/>
-              </w:rPr>
-              <w:t xml:space="preserve">•  </w:t>
-            </w:r>
-            <w:r>
-              <w:rPr>
-                <w:b w:val="0"/>
-                <w:i w:val="0"/>
-                <w:sz w:val="21"/>
-              </w:rPr>
-              <w:t xml:space="preserve">SOF record needs </w:t>
-            </w:r>
-            <w:r>
-              <w:rPr>
-                <w:b/>
-                <w:i w:val="0"/>
-                <w:sz w:val="21"/>
-              </w:rPr>
-              <w:t>quantity</w:t>
-            </w:r>
-            <w:r>
-              <w:rPr>
-                <w:b w:val="0"/>
-                <w:i w:val="0"/>
-                <w:sz w:val="21"/>
-              </w:rPr>
-              <w:t xml:space="preserve"> + </w:t>
-            </w:r>
-            <w:r>
-              <w:rPr>
-                <w:b/>
-                <w:i w:val="0"/>
-                <w:sz w:val="21"/>
-              </w:rPr>
-              <w:t>signature of the party charged</w:t>
-            </w:r>
-            <w:r>
-              <w:rPr>
-                <w:b w:val="0"/>
-                <w:i w:val="0"/>
-                <w:sz w:val="21"/>
-              </w:rPr>
-              <w:t xml:space="preserve"> — not price.</w:t>
-            </w:r>
-          </w:p>
-          <w:p>
-            <w:pPr>
-              <w:spacing w:after="30" w:line="240" w:lineRule="auto"/>
-              <w:ind w:left="288" w:hanging="202"/>
-            </w:pPr>
-            <w:r>
-              <w:rPr>
-                <w:color w:val="C77700"/>
-                <w:sz w:val="21"/>
-              </w:rPr>
-              <w:t xml:space="preserve">•  </w:t>
-            </w:r>
-            <w:r>
-              <w:rPr>
-                <w:b w:val="0"/>
-                <w:i w:val="0"/>
-                <w:sz w:val="21"/>
-              </w:rPr>
-              <w:t xml:space="preserve">Modification: </w:t>
-            </w:r>
-            <w:r>
-              <w:rPr>
-                <w:b/>
-                <w:i w:val="0"/>
-                <w:sz w:val="21"/>
-              </w:rPr>
-              <w:t>no consideration</w:t>
-            </w:r>
-            <w:r>
-              <w:rPr>
-                <w:b w:val="0"/>
-                <w:i w:val="0"/>
-                <w:sz w:val="21"/>
-              </w:rPr>
-              <w:t xml:space="preserve">, but </w:t>
-            </w:r>
-            <w:r>
-              <w:rPr>
-                <w:b/>
-                <w:i w:val="0"/>
-                <w:sz w:val="21"/>
-              </w:rPr>
-              <w:t>good faith</w:t>
-            </w:r>
-            <w:r>
-              <w:rPr>
-                <w:b w:val="0"/>
-                <w:i w:val="0"/>
-                <w:sz w:val="21"/>
-              </w:rPr>
-              <w:t xml:space="preserve"> and the </w:t>
-            </w:r>
-            <w:r>
-              <w:rPr>
-                <w:b/>
-                <w:i w:val="0"/>
-                <w:sz w:val="21"/>
-              </w:rPr>
-              <w:t>SOF if the modified deal is $500+</w:t>
-            </w:r>
-            <w:r>
-              <w:rPr>
-                <w:b w:val="0"/>
-                <w:i w:val="0"/>
-                <w:sz w:val="21"/>
-              </w:rPr>
-              <w:t>.</w:t>
-            </w:r>
-          </w:p>
-          <w:p>
-            <w:pPr>
-              <w:spacing w:after="30" w:line="240" w:lineRule="auto"/>
-              <w:ind w:left="288" w:hanging="202"/>
-            </w:pPr>
-            <w:r>
-              <w:rPr>
-                <w:color w:val="C77700"/>
-                <w:sz w:val="21"/>
-              </w:rPr>
-              <w:t xml:space="preserve">•  </w:t>
-            </w:r>
-            <w:r>
-              <w:rPr>
-                <w:b w:val="0"/>
-                <w:i w:val="0"/>
-                <w:sz w:val="21"/>
-              </w:rPr>
-              <w:t xml:space="preserve">Accepting a late delivery isn't a waiver of damages, but </w:t>
-            </w:r>
-            <w:r>
-              <w:rPr>
-                <w:b/>
-                <w:i w:val="0"/>
-                <w:sz w:val="21"/>
-              </w:rPr>
-              <w:t>notice of breach</w:t>
-            </w:r>
-            <w:r>
-              <w:rPr>
-                <w:b w:val="0"/>
-                <w:i w:val="0"/>
-                <w:sz w:val="21"/>
-              </w:rPr>
-              <w:t xml:space="preserve"> is required (§ 2-607(3)(a)).</w:t>
-            </w:r>
-          </w:p>
-          <w:p>
-            <w:pPr>
-              <w:spacing w:after="30" w:line="240" w:lineRule="auto"/>
-              <w:ind w:left="288" w:hanging="202"/>
-            </w:pPr>
-            <w:r>
-              <w:rPr>
-                <w:color w:val="C77700"/>
-                <w:sz w:val="21"/>
-              </w:rPr>
-              <w:t xml:space="preserve">•  </w:t>
-            </w:r>
-            <w:r>
-              <w:rPr>
-                <w:b w:val="0"/>
-                <w:i w:val="0"/>
-                <w:sz w:val="21"/>
-              </w:rPr>
-              <w:t xml:space="preserve">Good faith </w:t>
-            </w:r>
-            <w:r>
-              <w:rPr>
-                <w:b/>
-                <w:i w:val="0"/>
-                <w:sz w:val="21"/>
-              </w:rPr>
-              <w:t>can't be disclaimed</w:t>
-            </w:r>
-            <w:r>
-              <w:rPr>
-                <w:b w:val="0"/>
-                <w:i w:val="0"/>
-                <w:sz w:val="21"/>
-              </w:rPr>
-              <w:t xml:space="preserve"> and isn't a stand-alone claim.</w:t>
-            </w:r>
-          </w:p>
-          <w:p>
-            <w:pPr>
-              <w:spacing w:after="30" w:line="240" w:lineRule="auto"/>
-              <w:ind w:left="288" w:hanging="202"/>
-            </w:pPr>
-            <w:r>
-              <w:rPr>
-                <w:color w:val="C77700"/>
-                <w:sz w:val="21"/>
-              </w:rPr>
-              <w:t xml:space="preserve">•  </w:t>
-            </w:r>
-            <w:r>
-              <w:rPr>
-                <w:b w:val="0"/>
-                <w:i w:val="0"/>
-                <w:sz w:val="21"/>
-              </w:rPr>
-              <w:t xml:space="preserve">Express warranty: no intent or magic words; </w:t>
-            </w:r>
-            <w:r>
-              <w:rPr>
-                <w:b/>
-                <w:i w:val="0"/>
-                <w:sz w:val="21"/>
-              </w:rPr>
-              <w:t>opinion/value/praise</w:t>
-            </w:r>
-            <w:r>
-              <w:rPr>
-                <w:b w:val="0"/>
-                <w:i w:val="0"/>
-                <w:sz w:val="21"/>
-              </w:rPr>
-              <w:t xml:space="preserve"> don't count; reliance may not be required.</w:t>
-            </w:r>
-          </w:p>
-          <w:p>
-            <w:pPr>
-              <w:spacing w:after="30" w:line="240" w:lineRule="auto"/>
-              <w:ind w:left="288" w:hanging="202"/>
-            </w:pPr>
-            <w:r>
-              <w:rPr>
-                <w:color w:val="C77700"/>
-                <w:sz w:val="21"/>
-              </w:rPr>
-              <w:t xml:space="preserve">•  </w:t>
-            </w:r>
-            <w:r>
-              <w:rPr>
-                <w:b w:val="0"/>
-                <w:i w:val="0"/>
-                <w:sz w:val="21"/>
-              </w:rPr>
-              <w:t xml:space="preserve">Fitness: </w:t>
-            </w:r>
-            <w:r>
-              <w:rPr>
-                <w:b/>
-                <w:i w:val="0"/>
-                <w:sz w:val="21"/>
-              </w:rPr>
-              <w:t>any seller</w:t>
-            </w:r>
-            <w:r>
-              <w:rPr>
-                <w:b w:val="0"/>
-                <w:i w:val="0"/>
-                <w:sz w:val="21"/>
-              </w:rPr>
-              <w:t xml:space="preserve">; </w:t>
-            </w:r>
-            <w:r>
-              <w:rPr>
-                <w:b/>
-                <w:i w:val="0"/>
-                <w:sz w:val="21"/>
-              </w:rPr>
-              <w:t>particular</w:t>
-            </w:r>
-            <w:r>
-              <w:rPr>
-                <w:b w:val="0"/>
-                <w:i w:val="0"/>
-                <w:sz w:val="21"/>
-              </w:rPr>
-              <w:t xml:space="preserve"> purpose + </w:t>
-            </w:r>
-            <w:r>
-              <w:rPr>
-                <w:b/>
-                <w:i w:val="0"/>
-                <w:sz w:val="21"/>
-              </w:rPr>
-              <w:t>actual reliance</w:t>
-            </w:r>
-            <w:r>
-              <w:rPr>
-                <w:b w:val="0"/>
-                <w:i w:val="0"/>
-                <w:sz w:val="21"/>
-              </w:rPr>
-              <w:t xml:space="preserve">. Title: </w:t>
-            </w:r>
-            <w:r>
-              <w:rPr>
-                <w:b/>
-                <w:i w:val="0"/>
-                <w:sz w:val="21"/>
-              </w:rPr>
-              <w:t>every seller</w:t>
-            </w:r>
-            <w:r>
-              <w:rPr>
-                <w:b w:val="0"/>
-                <w:i w:val="0"/>
-                <w:sz w:val="21"/>
-              </w:rPr>
-              <w:t xml:space="preserve">; "as is" </w:t>
-            </w:r>
-            <w:r>
-              <w:rPr>
-                <w:b/>
-                <w:i w:val="0"/>
-                <w:sz w:val="21"/>
-              </w:rPr>
-              <w:t>doesn't</w:t>
-            </w:r>
-            <w:r>
-              <w:rPr>
-                <w:b w:val="0"/>
-                <w:i w:val="0"/>
-                <w:sz w:val="21"/>
-              </w:rPr>
-              <w:t xml:space="preserve"> disclaim it.</w:t>
-            </w:r>
-          </w:p>
-          <w:p>
-            <w:pPr>
-              <w:spacing w:after="30" w:line="240" w:lineRule="auto"/>
-              <w:ind w:left="288" w:hanging="202"/>
-            </w:pPr>
-            <w:r>
-              <w:rPr>
-                <w:color w:val="C77700"/>
-                <w:sz w:val="21"/>
-              </w:rPr>
-              <w:t xml:space="preserve">•  </w:t>
-            </w:r>
-            <w:r>
-              <w:rPr>
-                <w:b w:val="0"/>
-                <w:i w:val="0"/>
-                <w:sz w:val="21"/>
-              </w:rPr>
-              <w:t xml:space="preserve">Merchantability disclaimer must </w:t>
-            </w:r>
-            <w:r>
-              <w:rPr>
-                <w:b/>
-                <w:i w:val="0"/>
-                <w:sz w:val="21"/>
-              </w:rPr>
-              <w:t>say "merchantability"</w:t>
-            </w:r>
-            <w:r>
-              <w:rPr>
-                <w:b w:val="0"/>
-                <w:i w:val="0"/>
-                <w:sz w:val="21"/>
-              </w:rPr>
-              <w:t xml:space="preserve"> (conspicuous if written); fitness needs a </w:t>
-            </w:r>
-            <w:r>
-              <w:rPr>
-                <w:b/>
-                <w:i w:val="0"/>
-                <w:sz w:val="21"/>
-              </w:rPr>
-              <w:t>conspicuous writing</w:t>
-            </w:r>
-            <w:r>
-              <w:rPr>
-                <w:b w:val="0"/>
-                <w:i w:val="0"/>
-                <w:sz w:val="21"/>
-              </w:rPr>
-              <w:t>.</w:t>
-            </w:r>
-          </w:p>
-          <w:p>
-            <w:pPr>
-              <w:spacing w:after="30" w:line="240" w:lineRule="auto"/>
-              <w:ind w:left="288" w:hanging="202"/>
-            </w:pPr>
-            <w:r>
-              <w:rPr>
-                <w:color w:val="C77700"/>
-                <w:sz w:val="21"/>
-              </w:rPr>
-              <w:t xml:space="preserve">•  </w:t>
-            </w:r>
-            <w:r>
-              <w:rPr>
-                <w:b w:val="0"/>
-                <w:i w:val="0"/>
-                <w:sz w:val="21"/>
-              </w:rPr>
-              <w:t xml:space="preserve">Examination exclusion requires an actual exam or </w:t>
-            </w:r>
-            <w:r>
-              <w:rPr>
-                <w:b/>
-                <w:i w:val="0"/>
-                <w:sz w:val="21"/>
-              </w:rPr>
-              <w:t>refusal after seller's demand</w:t>
-            </w:r>
-            <w:r>
-              <w:rPr>
-                <w:b w:val="0"/>
-                <w:i w:val="0"/>
-                <w:sz w:val="21"/>
-              </w:rPr>
-              <w:t>.</w:t>
-            </w:r>
-          </w:p>
-          <w:p>
-            <w:pPr>
-              <w:spacing w:after="30" w:line="240" w:lineRule="auto"/>
-              <w:ind w:left="288" w:hanging="202"/>
-            </w:pPr>
-            <w:r>
-              <w:rPr>
-                <w:color w:val="C77700"/>
-                <w:sz w:val="21"/>
-              </w:rPr>
-              <w:t xml:space="preserve">•  </w:t>
-            </w:r>
-            <w:r>
-              <w:rPr>
-                <w:b w:val="0"/>
-                <w:i w:val="0"/>
-                <w:sz w:val="21"/>
-              </w:rPr>
-              <w:t xml:space="preserve">Remedy limits </w:t>
-            </w:r>
-            <w:r>
-              <w:rPr>
-                <w:b/>
-                <w:i w:val="0"/>
-                <w:sz w:val="21"/>
-              </w:rPr>
-              <w:t>needn't be conspicuous</w:t>
-            </w:r>
-            <w:r>
-              <w:rPr>
-                <w:b w:val="0"/>
-                <w:i w:val="0"/>
-                <w:sz w:val="21"/>
-              </w:rPr>
-              <w:t xml:space="preserve">; consequential-damage exclusions for </w:t>
-            </w:r>
-            <w:r>
-              <w:rPr>
-                <w:b/>
-                <w:i w:val="0"/>
-                <w:sz w:val="21"/>
-              </w:rPr>
-              <w:t>consumer personal injury</w:t>
-            </w:r>
-            <w:r>
-              <w:rPr>
-                <w:b w:val="0"/>
-                <w:i w:val="0"/>
-                <w:sz w:val="21"/>
-              </w:rPr>
-              <w:t xml:space="preserve"> are </w:t>
-            </w:r>
-            <w:r>
-              <w:rPr>
-                <w:b/>
-                <w:i w:val="0"/>
-                <w:sz w:val="21"/>
-              </w:rPr>
-              <w:t>prima facie unconscionable</w:t>
-            </w:r>
-            <w:r>
-              <w:rPr>
-                <w:b w:val="0"/>
-                <w:i w:val="0"/>
-                <w:sz w:val="21"/>
-              </w:rPr>
-              <w:t>.</w:t>
-            </w:r>
-          </w:p>
-          <w:p>
-            <w:pPr>
-              <w:spacing w:after="30" w:line="240" w:lineRule="auto"/>
-              <w:ind w:left="288" w:hanging="202"/>
-            </w:pPr>
-            <w:r>
-              <w:rPr>
-                <w:color w:val="C77700"/>
-                <w:sz w:val="21"/>
-              </w:rPr>
-              <w:t xml:space="preserve">•  </w:t>
-            </w:r>
-            <w:r>
-              <w:rPr>
-                <w:b/>
-                <w:i w:val="0"/>
-                <w:sz w:val="21"/>
-              </w:rPr>
-              <w:t>Possession ≠ acceptance; payment ≠ acceptance</w:t>
-            </w:r>
-            <w:r>
-              <w:rPr>
-                <w:b w:val="0"/>
-                <w:i w:val="0"/>
-                <w:sz w:val="21"/>
-              </w:rPr>
-              <w:t xml:space="preserve">; failing to reject after inspection </w:t>
-            </w:r>
-            <w:r>
-              <w:rPr>
-                <w:b/>
-                <w:i w:val="0"/>
-                <w:sz w:val="21"/>
-              </w:rPr>
-              <w:t>is</w:t>
-            </w:r>
-            <w:r>
-              <w:rPr>
-                <w:b w:val="0"/>
-                <w:i w:val="0"/>
-                <w:sz w:val="21"/>
-              </w:rPr>
-              <w:t xml:space="preserve"> acceptance.</w:t>
-            </w:r>
-          </w:p>
-          <w:p>
-            <w:pPr>
-              <w:spacing w:after="30" w:line="240" w:lineRule="auto"/>
-              <w:ind w:left="288" w:hanging="202"/>
-            </w:pPr>
-            <w:r>
-              <w:rPr>
-                <w:color w:val="C77700"/>
-                <w:sz w:val="21"/>
-              </w:rPr>
-              <w:t xml:space="preserve">•  </w:t>
-            </w:r>
-            <w:r>
-              <w:rPr>
-                <w:b w:val="0"/>
-                <w:i w:val="0"/>
-                <w:sz w:val="21"/>
-              </w:rPr>
-              <w:t xml:space="preserve">Risk: </w:t>
-            </w:r>
-            <w:r>
-              <w:rPr>
-                <w:b/>
-                <w:i w:val="0"/>
-                <w:sz w:val="21"/>
-              </w:rPr>
-              <w:t>merchant seller → buyer's receipt</w:t>
-            </w:r>
-            <w:r>
-              <w:rPr>
-                <w:b w:val="0"/>
-                <w:i w:val="0"/>
-                <w:sz w:val="21"/>
-              </w:rPr>
-              <w:t xml:space="preserve"> — even if buyer paid; </w:t>
-            </w:r>
-            <w:r>
-              <w:rPr>
-                <w:b/>
-                <w:i w:val="0"/>
-                <w:sz w:val="21"/>
-              </w:rPr>
-              <w:t>seller's own truck isn't a carrier</w:t>
-            </w:r>
-            <w:r>
-              <w:rPr>
-                <w:b w:val="0"/>
-                <w:i w:val="0"/>
-                <w:sz w:val="21"/>
-              </w:rPr>
-              <w:t xml:space="preserve">; shipment contract is </w:t>
-            </w:r>
-            <w:r>
-              <w:rPr>
-                <w:b/>
-                <w:i w:val="0"/>
-                <w:sz w:val="21"/>
-              </w:rPr>
-              <w:t>presumed</w:t>
-            </w:r>
-            <w:r>
-              <w:rPr>
-                <w:b w:val="0"/>
-                <w:i w:val="0"/>
-                <w:sz w:val="21"/>
-              </w:rPr>
-              <w:t>.</w:t>
-            </w:r>
-          </w:p>
-          <w:p>
-            <w:pPr>
-              <w:spacing w:after="30" w:line="240" w:lineRule="auto"/>
-              <w:ind w:left="288" w:hanging="202"/>
-            </w:pPr>
-            <w:r>
-              <w:rPr>
-                <w:color w:val="C77700"/>
-                <w:sz w:val="21"/>
-              </w:rPr>
-              <w:t xml:space="preserve">•  </w:t>
-            </w:r>
-            <w:r>
-              <w:rPr>
-                <w:b w:val="0"/>
-                <w:i w:val="0"/>
-                <w:sz w:val="21"/>
-              </w:rPr>
-              <w:t xml:space="preserve">PER never bars </w:t>
-            </w:r>
-            <w:r>
-              <w:rPr>
-                <w:b/>
-                <w:i w:val="0"/>
-                <w:sz w:val="21"/>
-              </w:rPr>
-              <w:t>later</w:t>
-            </w:r>
-            <w:r>
-              <w:rPr>
-                <w:b w:val="0"/>
-                <w:i w:val="0"/>
-                <w:sz w:val="21"/>
-              </w:rPr>
-              <w:t xml:space="preserve"> agreements or </w:t>
-            </w:r>
-            <w:r>
-              <w:rPr>
-                <w:b/>
-                <w:i w:val="0"/>
-                <w:sz w:val="21"/>
-              </w:rPr>
-              <w:t>fraud</w:t>
-            </w:r>
-            <w:r>
-              <w:rPr>
-                <w:b w:val="0"/>
-                <w:i w:val="0"/>
-                <w:sz w:val="21"/>
-              </w:rPr>
-              <w:t xml:space="preserve">; UoT/CoD/CoP can supplement even a </w:t>
-            </w:r>
-            <w:r>
-              <w:rPr>
-                <w:b/>
-                <w:i w:val="0"/>
-                <w:sz w:val="21"/>
-              </w:rPr>
-              <w:t>complete</w:t>
-            </w:r>
-            <w:r>
-              <w:rPr>
-                <w:b w:val="0"/>
-                <w:i w:val="0"/>
-                <w:sz w:val="21"/>
-              </w:rPr>
-              <w:t xml:space="preserve"> writing.</w:t>
-            </w:r>
-          </w:p>
-          <w:p>
-            <w:pPr>
-              <w:spacing w:after="30" w:line="240" w:lineRule="auto"/>
-              <w:ind w:left="288" w:hanging="202"/>
-            </w:pPr>
-            <w:r>
-              <w:rPr>
-                <w:color w:val="C77700"/>
-                <w:sz w:val="21"/>
-              </w:rPr>
-              <w:t xml:space="preserve">•  </w:t>
-            </w:r>
-            <w:r>
-              <w:rPr>
-                <w:b w:val="0"/>
-                <w:i w:val="0"/>
-                <w:sz w:val="21"/>
-              </w:rPr>
-              <w:t>A ban on assigning "</w:t>
-            </w:r>
-            <w:r>
-              <w:rPr>
-                <w:b/>
-                <w:i w:val="0"/>
-                <w:sz w:val="21"/>
-              </w:rPr>
-              <w:t>the contract</w:t>
-            </w:r>
-            <w:r>
-              <w:rPr>
-                <w:b w:val="0"/>
-                <w:i w:val="0"/>
-                <w:sz w:val="21"/>
-              </w:rPr>
-              <w:t xml:space="preserve">" bars only </w:t>
-            </w:r>
-            <w:r>
-              <w:rPr>
-                <w:b/>
-                <w:i w:val="0"/>
-                <w:sz w:val="21"/>
-              </w:rPr>
-              <w:t>delegation</w:t>
-            </w:r>
-            <w:r>
-              <w:rPr>
-                <w:b w:val="0"/>
-                <w:i w:val="0"/>
-                <w:sz w:val="21"/>
-              </w:rPr>
-              <w:t>; the right to payment is assignable despite a "void" clause.</w:t>
-            </w:r>
-          </w:p>
-          <w:p>
-            <w:pPr>
-              <w:spacing w:after="30" w:line="240" w:lineRule="auto"/>
-              <w:ind w:left="288" w:hanging="202"/>
-            </w:pPr>
-            <w:r>
-              <w:rPr>
-                <w:color w:val="C77700"/>
-                <w:sz w:val="21"/>
-              </w:rPr>
-              <w:t xml:space="preserve">•  </w:t>
-            </w:r>
-            <w:r>
-              <w:rPr>
-                <w:b w:val="0"/>
-                <w:i w:val="0"/>
-                <w:sz w:val="21"/>
-              </w:rPr>
-              <w:t xml:space="preserve">§ 2-609 demand must be </w:t>
-            </w:r>
-            <w:r>
-              <w:rPr>
-                <w:b/>
-                <w:i w:val="0"/>
-                <w:sz w:val="21"/>
-              </w:rPr>
-              <w:t>in writing</w:t>
-            </w:r>
-            <w:r>
-              <w:rPr>
-                <w:b w:val="0"/>
-                <w:i w:val="0"/>
-                <w:sz w:val="21"/>
-              </w:rPr>
-              <w:t xml:space="preserve">; no adequate assurance within </w:t>
-            </w:r>
-            <w:r>
-              <w:rPr>
-                <w:b/>
-                <w:i w:val="0"/>
-                <w:sz w:val="21"/>
-              </w:rPr>
-              <w:t>30 days</w:t>
-            </w:r>
-            <w:r>
-              <w:rPr>
-                <w:b w:val="0"/>
-                <w:i w:val="0"/>
-                <w:sz w:val="21"/>
-              </w:rPr>
-              <w:t xml:space="preserve"> = repudiation.</w:t>
-            </w:r>
-          </w:p>
-          <w:p>
-            <w:pPr>
-              <w:spacing w:after="30" w:line="240" w:lineRule="auto"/>
-              <w:ind w:left="288" w:hanging="202"/>
-            </w:pPr>
-            <w:r>
-              <w:rPr>
-                <w:color w:val="C77700"/>
-                <w:sz w:val="21"/>
-              </w:rPr>
-              <w:t xml:space="preserve">•  </w:t>
-            </w:r>
-            <w:r>
-              <w:rPr>
-                <w:b/>
-                <w:i w:val="0"/>
-                <w:sz w:val="21"/>
-              </w:rPr>
-              <w:t>Cost increases alone never excuse</w:t>
-            </w:r>
-            <w:r>
-              <w:rPr>
-                <w:b w:val="0"/>
-                <w:i w:val="0"/>
-                <w:sz w:val="21"/>
-              </w:rPr>
-              <w:t xml:space="preserve">; § 2-613 needs </w:t>
-            </w:r>
-            <w:r>
-              <w:rPr>
-                <w:b/>
-                <w:i w:val="0"/>
-                <w:sz w:val="21"/>
-              </w:rPr>
-              <w:t>identified goods + no fault + risk not yet passed</w:t>
-            </w:r>
-            <w:r>
-              <w:rPr>
-                <w:b w:val="0"/>
-                <w:i w:val="0"/>
-                <w:sz w:val="21"/>
-              </w:rPr>
-              <w:t>.</w:t>
-            </w:r>
-          </w:p>
-        </w:tc>
-      </w:tr>
-    </w:tbl>
-    <w:p>
-      <w:pPr>
-        <w:spacing w:after="0" w:line="120" w:lineRule="exact"/>
-      </w:pPr>
-    </w:p>
     <w:sectPr>
       <w:headerReference w:type="default" r:id="rId9"/>
       <w:footerReference w:type="default" r:id="rId10"/>

</xml_diff>